<commit_message>
avoid nodes and segments
</commit_message>
<xml_diff>
--- a/Project1-Simple-Examples.docx
+++ b/Project1-Simple-Examples.docx
@@ -1,6 +1,6 @@
 
 <file path=word/document.xml><?xml version="1.0" encoding="utf-8"?>
-<w:document xmlns:wpc="http://schemas.microsoft.com/office/word/2010/wordprocessingCanvas" xmlns:cx="http://schemas.microsoft.com/office/drawing/2014/chartex" xmlns:cx1="http://schemas.microsoft.com/office/drawing/2015/9/8/chartex" xmlns:cx2="http://schemas.microsoft.com/office/drawing/2015/10/21/chartex" xmlns:cx3="http://schemas.microsoft.com/office/drawing/2016/5/9/chartex" xmlns:cx4="http://schemas.microsoft.com/office/drawing/2016/5/10/chartex" xmlns:cx5="http://schemas.microsoft.com/office/drawing/2016/5/11/chartex" xmlns:cx6="http://schemas.microsoft.com/office/drawing/2016/5/12/chartex" xmlns:cx7="http://schemas.microsoft.com/office/drawing/2016/5/13/chartex" xmlns:cx8="http://schemas.microsoft.com/office/drawing/2016/5/14/chartex" xmlns:mc="http://schemas.openxmlformats.org/markup-compatibility/2006" xmlns:aink="http://schemas.microsoft.com/office/drawing/2016/ink" xmlns:am3d="http://schemas.microsoft.com/office/drawing/2017/model3d" xmlns:o="urn:schemas-microsoft-com:office:office" xmlns:r="http://schemas.openxmlformats.org/officeDocument/2006/relationships" xmlns:m="http://schemas.openxmlformats.org/officeDocument/2006/math" xmlns:v="urn:schemas-microsoft-com:vml" xmlns:wp14="http://schemas.microsoft.com/office/word/2010/wordprocessingDrawing" xmlns:wp="http://schemas.openxmlformats.org/drawingml/2006/wordprocessingDrawing" xmlns:w10="urn:schemas-microsoft-com:office:word" xmlns:w="http://schemas.openxmlformats.org/wordprocessingml/2006/main" xmlns:w14="http://schemas.microsoft.com/office/word/2010/wordml" xmlns:w15="http://schemas.microsoft.com/office/word/2012/wordml" xmlns:w16cid="http://schemas.microsoft.com/office/word/2016/wordml/cid" xmlns:w16se="http://schemas.microsoft.com/office/word/2015/wordml/symex" xmlns:wpg="http://schemas.microsoft.com/office/word/2010/wordprocessingGroup" xmlns:wpi="http://schemas.microsoft.com/office/word/2010/wordprocessingInk" xmlns:wne="http://schemas.microsoft.com/office/word/2006/wordml" xmlns:wps="http://schemas.microsoft.com/office/word/2010/wordprocessingShape" mc:Ignorable="w14 w15 w16se w16cid wp14">
+<w:document xmlns:wpc="http://schemas.microsoft.com/office/word/2010/wordprocessingCanvas" xmlns:cx="http://schemas.microsoft.com/office/drawing/2014/chartex" xmlns:cx1="http://schemas.microsoft.com/office/drawing/2015/9/8/chartex" xmlns:cx2="http://schemas.microsoft.com/office/drawing/2015/10/21/chartex" xmlns:cx3="http://schemas.microsoft.com/office/drawing/2016/5/9/chartex" xmlns:cx4="http://schemas.microsoft.com/office/drawing/2016/5/10/chartex" xmlns:cx5="http://schemas.microsoft.com/office/drawing/2016/5/11/chartex" xmlns:cx6="http://schemas.microsoft.com/office/drawing/2016/5/12/chartex" xmlns:cx7="http://schemas.microsoft.com/office/drawing/2016/5/13/chartex" xmlns:cx8="http://schemas.microsoft.com/office/drawing/2016/5/14/chartex" xmlns:mc="http://schemas.openxmlformats.org/markup-compatibility/2006" xmlns:aink="http://schemas.microsoft.com/office/drawing/2016/ink" xmlns:am3d="http://schemas.microsoft.com/office/drawing/2017/model3d" xmlns:o="urn:schemas-microsoft-com:office:office" xmlns:oel="http://schemas.microsoft.com/office/2019/extlst" xmlns:r="http://schemas.openxmlformats.org/officeDocument/2006/relationships" xmlns:m="http://schemas.openxmlformats.org/officeDocument/2006/math" xmlns:v="urn:schemas-microsoft-com:vml" xmlns:wp14="http://schemas.microsoft.com/office/word/2010/wordprocessingDrawing" xmlns:wp="http://schemas.openxmlformats.org/drawingml/2006/wordprocessingDrawing" xmlns:w10="urn:schemas-microsoft-com:office:word" xmlns:w="http://schemas.openxmlformats.org/wordprocessingml/2006/main" xmlns:w14="http://schemas.microsoft.com/office/word/2010/wordml" xmlns:w15="http://schemas.microsoft.com/office/word/2012/wordml" xmlns:w16cex="http://schemas.microsoft.com/office/word/2018/wordml/cex" xmlns:w16cid="http://schemas.microsoft.com/office/word/2016/wordml/cid" xmlns:w16="http://schemas.microsoft.com/office/word/2018/wordml" xmlns:w16du="http://schemas.microsoft.com/office/word/2023/wordml/word16du" xmlns:w16sdtdh="http://schemas.microsoft.com/office/word/2020/wordml/sdtdatahash" xmlns:w16sdtfl="http://schemas.microsoft.com/office/word/2024/wordml/sdtformatlock" xmlns:w16se="http://schemas.microsoft.com/office/word/2015/wordml/symex" xmlns:wpg="http://schemas.microsoft.com/office/word/2010/wordprocessingGroup" xmlns:wpi="http://schemas.microsoft.com/office/word/2010/wordprocessingInk" xmlns:wne="http://schemas.microsoft.com/office/word/2006/wordml" xmlns:wps="http://schemas.microsoft.com/office/word/2010/wordprocessingShape" mc:Ignorable="w14 w15 w16se w16cid w16 w16cex w16sdtdh w16sdtfl w16du wp14">
   <w:background w:color="FFFFFF"/>
   <w:body>
     <w:p>
@@ -40,18 +40,7 @@
           <w:szCs w:val="40"/>
           <w:lang w:val="en-US"/>
         </w:rPr>
-        <w:t>Programming Project I</w:t>
-      </w:r>
-      <w:r>
-        <w:rPr>
-          <w:rFonts w:ascii="Garamond" w:eastAsia="Garamond" w:hAnsi="Garamond" w:cs="Garamond"/>
-          <w:b/>
-          <w:i/>
-          <w:sz w:val="40"/>
-          <w:szCs w:val="40"/>
-          <w:lang w:val="en-US"/>
-        </w:rPr>
-        <w:t xml:space="preserve"> - Small Sample Examples</w:t>
+        <w:t>Programming Project I - Small Sample Examples</w:t>
       </w:r>
     </w:p>
     <w:p>
@@ -236,140 +225,16 @@
           <w:i/>
           <w:sz w:val="24"/>
           <w:szCs w:val="24"/>
-          <w:lang w:val="en-US"/>
-        </w:rPr>
-      </w:pPr>
-      <w:proofErr w:type="spellStart"/>
+        </w:rPr>
+      </w:pPr>
       <w:r>
         <w:rPr>
           <w:rFonts w:ascii="Garamond" w:eastAsia="Garamond" w:hAnsi="Garamond" w:cs="Garamond"/>
           <w:i/>
           <w:sz w:val="24"/>
           <w:szCs w:val="24"/>
-          <w:lang w:val="en-US"/>
-        </w:rPr>
-        <w:t>Departamento</w:t>
-      </w:r>
-      <w:proofErr w:type="spellEnd"/>
-      <w:r>
-        <w:rPr>
-          <w:rFonts w:ascii="Garamond" w:eastAsia="Garamond" w:hAnsi="Garamond" w:cs="Garamond"/>
-          <w:i/>
-          <w:sz w:val="24"/>
-          <w:szCs w:val="24"/>
-          <w:lang w:val="en-US"/>
-        </w:rPr>
-        <w:t xml:space="preserve"> de </w:t>
-      </w:r>
-      <w:proofErr w:type="spellStart"/>
-      <w:r>
-        <w:rPr>
-          <w:rFonts w:ascii="Garamond" w:eastAsia="Garamond" w:hAnsi="Garamond" w:cs="Garamond"/>
-          <w:i/>
-          <w:sz w:val="24"/>
-          <w:szCs w:val="24"/>
-          <w:lang w:val="en-US"/>
-        </w:rPr>
-        <w:t>Engenharia</w:t>
-      </w:r>
-      <w:proofErr w:type="spellEnd"/>
-      <w:r>
-        <w:rPr>
-          <w:rFonts w:ascii="Garamond" w:eastAsia="Garamond" w:hAnsi="Garamond" w:cs="Garamond"/>
-          <w:i/>
-          <w:sz w:val="24"/>
-          <w:szCs w:val="24"/>
-          <w:lang w:val="en-US"/>
-        </w:rPr>
-        <w:t xml:space="preserve"> </w:t>
-      </w:r>
-      <w:proofErr w:type="spellStart"/>
-      <w:r>
-        <w:rPr>
-          <w:rFonts w:ascii="Garamond" w:eastAsia="Garamond" w:hAnsi="Garamond" w:cs="Garamond"/>
-          <w:i/>
-          <w:sz w:val="24"/>
-          <w:szCs w:val="24"/>
-          <w:lang w:val="en-US"/>
-        </w:rPr>
-        <w:t>Informática</w:t>
-      </w:r>
-      <w:proofErr w:type="spellEnd"/>
-      <w:r>
-        <w:rPr>
-          <w:rFonts w:ascii="Garamond" w:eastAsia="Garamond" w:hAnsi="Garamond" w:cs="Garamond"/>
-          <w:i/>
-          <w:sz w:val="24"/>
-          <w:szCs w:val="24"/>
-          <w:lang w:val="en-US"/>
-        </w:rPr>
-        <w:t xml:space="preserve"> (DEI)/</w:t>
-      </w:r>
-      <w:proofErr w:type="spellStart"/>
-      <w:r>
-        <w:rPr>
-          <w:rFonts w:ascii="Garamond" w:eastAsia="Garamond" w:hAnsi="Garamond" w:cs="Garamond"/>
-          <w:i/>
-          <w:sz w:val="24"/>
-          <w:szCs w:val="24"/>
-          <w:lang w:val="en-US"/>
-        </w:rPr>
-        <w:t>Departamento</w:t>
-      </w:r>
-      <w:proofErr w:type="spellEnd"/>
-      <w:r>
-        <w:rPr>
-          <w:rFonts w:ascii="Garamond" w:eastAsia="Garamond" w:hAnsi="Garamond" w:cs="Garamond"/>
-          <w:i/>
-          <w:sz w:val="24"/>
-          <w:szCs w:val="24"/>
-          <w:lang w:val="en-US"/>
-        </w:rPr>
-        <w:t xml:space="preserve"> de </w:t>
-      </w:r>
-      <w:proofErr w:type="spellStart"/>
-      <w:r>
-        <w:rPr>
-          <w:rFonts w:ascii="Garamond" w:eastAsia="Garamond" w:hAnsi="Garamond" w:cs="Garamond"/>
-          <w:i/>
-          <w:sz w:val="24"/>
-          <w:szCs w:val="24"/>
-          <w:lang w:val="en-US"/>
-        </w:rPr>
-        <w:t>Ciências</w:t>
-      </w:r>
-      <w:proofErr w:type="spellEnd"/>
-      <w:r>
-        <w:rPr>
-          <w:rFonts w:ascii="Garamond" w:eastAsia="Garamond" w:hAnsi="Garamond" w:cs="Garamond"/>
-          <w:i/>
-          <w:sz w:val="24"/>
-          <w:szCs w:val="24"/>
-          <w:lang w:val="en-US"/>
-        </w:rPr>
-        <w:t xml:space="preserve"> de </w:t>
-      </w:r>
-      <w:proofErr w:type="spellStart"/>
-      <w:r>
-        <w:rPr>
-          <w:rFonts w:ascii="Garamond" w:eastAsia="Garamond" w:hAnsi="Garamond" w:cs="Garamond"/>
-          <w:i/>
-          <w:sz w:val="24"/>
-          <w:szCs w:val="24"/>
-          <w:lang w:val="en-US"/>
-        </w:rPr>
-        <w:t>Computadores</w:t>
-      </w:r>
-      <w:proofErr w:type="spellEnd"/>
-      <w:r>
-        <w:rPr>
-          <w:rFonts w:ascii="Garamond" w:eastAsia="Garamond" w:hAnsi="Garamond" w:cs="Garamond"/>
-          <w:i/>
-          <w:sz w:val="24"/>
-          <w:szCs w:val="24"/>
-          <w:lang w:val="en-US"/>
-        </w:rPr>
-        <w:t xml:space="preserve"> (DCC)</w:t>
+        </w:rPr>
+        <w:t>Departamento de Engenharia Informática (DEI)/Departamento de Ciências de Computadores (DCC)</w:t>
       </w:r>
     </w:p>
     <w:p>
@@ -396,74 +261,56 @@
           <w:i/>
           <w:sz w:val="24"/>
           <w:szCs w:val="24"/>
-          <w:lang w:val="en-US"/>
-        </w:rPr>
-      </w:pPr>
-      <w:proofErr w:type="spellStart"/>
+        </w:rPr>
+      </w:pPr>
       <w:r>
         <w:rPr>
           <w:rFonts w:ascii="Garamond" w:eastAsia="Garamond" w:hAnsi="Garamond" w:cs="Garamond"/>
           <w:i/>
           <w:sz w:val="24"/>
           <w:szCs w:val="24"/>
-          <w:lang w:val="en-US"/>
-        </w:rPr>
-        <w:t>Faculdade</w:t>
-      </w:r>
-      <w:proofErr w:type="spellEnd"/>
+        </w:rPr>
+        <w:t xml:space="preserve">Faculdade de Eng. da </w:t>
+      </w:r>
+      <w:proofErr w:type="spellStart"/>
       <w:r>
         <w:rPr>
           <w:rFonts w:ascii="Garamond" w:eastAsia="Garamond" w:hAnsi="Garamond" w:cs="Garamond"/>
           <w:i/>
           <w:sz w:val="24"/>
           <w:szCs w:val="24"/>
-          <w:lang w:val="en-US"/>
-        </w:rPr>
-        <w:t xml:space="preserve"> de Eng. da Univ. do Porto (FEUP)/</w:t>
-      </w:r>
-      <w:proofErr w:type="spellStart"/>
+        </w:rPr>
+        <w:t>Univ</w:t>
+      </w:r>
+      <w:proofErr w:type="spellEnd"/>
       <w:r>
         <w:rPr>
           <w:rFonts w:ascii="Garamond" w:eastAsia="Garamond" w:hAnsi="Garamond" w:cs="Garamond"/>
           <w:i/>
           <w:sz w:val="24"/>
           <w:szCs w:val="24"/>
-          <w:lang w:val="en-US"/>
-        </w:rPr>
-        <w:t>Faculdade</w:t>
-      </w:r>
-      <w:proofErr w:type="spellEnd"/>
+        </w:rPr>
+        <w:t xml:space="preserve">. do Porto (FEUP)/Faculdade de Ciências da </w:t>
+      </w:r>
+      <w:proofErr w:type="spellStart"/>
       <w:r>
         <w:rPr>
           <w:rFonts w:ascii="Garamond" w:eastAsia="Garamond" w:hAnsi="Garamond" w:cs="Garamond"/>
           <w:i/>
           <w:sz w:val="24"/>
           <w:szCs w:val="24"/>
-          <w:lang w:val="en-US"/>
-        </w:rPr>
-        <w:t xml:space="preserve"> de </w:t>
-      </w:r>
-      <w:proofErr w:type="spellStart"/>
+        </w:rPr>
+        <w:t>Univ</w:t>
+      </w:r>
+      <w:proofErr w:type="spellEnd"/>
       <w:r>
         <w:rPr>
           <w:rFonts w:ascii="Garamond" w:eastAsia="Garamond" w:hAnsi="Garamond" w:cs="Garamond"/>
           <w:i/>
           <w:sz w:val="24"/>
           <w:szCs w:val="24"/>
-          <w:lang w:val="en-US"/>
-        </w:rPr>
-        <w:t>Ciências</w:t>
-      </w:r>
-      <w:proofErr w:type="spellEnd"/>
-      <w:r>
-        <w:rPr>
-          <w:rFonts w:ascii="Garamond" w:eastAsia="Garamond" w:hAnsi="Garamond" w:cs="Garamond"/>
-          <w:i/>
-          <w:sz w:val="24"/>
-          <w:szCs w:val="24"/>
-          <w:lang w:val="en-US"/>
-        </w:rPr>
-        <w:t xml:space="preserve"> da Univ. do Porto (FCUP)</w:t>
+        </w:rPr>
+        <w:t>. do Porto (FCUP)</w:t>
       </w:r>
     </w:p>
     <w:p>
@@ -490,7 +337,6 @@
           <w:i/>
           <w:sz w:val="20"/>
           <w:szCs w:val="20"/>
-          <w:lang w:val="en-US"/>
         </w:rPr>
       </w:pPr>
     </w:p>
@@ -777,6 +623,7 @@
       </w:pPr>
       <w:r>
         <w:rPr>
+          <w:noProof/>
           <w:lang w:val="en-US"/>
         </w:rPr>
         <w:drawing>
@@ -875,7 +722,7 @@
     </w:p>
     <w:p>
       <w:pPr>
-        <w:pStyle w:val="Heading1"/>
+        <w:pStyle w:val="Ttulo1"/>
         <w:numPr>
           <w:ilvl w:val="0"/>
           <w:numId w:val="1"/>
@@ -903,7 +750,7 @@
     </w:p>
     <w:p>
       <w:pPr>
-        <w:pStyle w:val="Heading2"/>
+        <w:pStyle w:val="Ttulo2"/>
         <w:spacing w:before="0" w:after="0" w:line="240" w:lineRule="auto"/>
         <w:rPr>
           <w:rFonts w:ascii="Garamond" w:hAnsi="Garamond"/>
@@ -1015,7 +862,7 @@
     </w:p>
     <w:p>
       <w:pPr>
-        <w:pStyle w:val="Heading2"/>
+        <w:pStyle w:val="Ttulo2"/>
         <w:numPr>
           <w:ilvl w:val="0"/>
           <w:numId w:val="1"/>
@@ -1125,7 +972,7 @@
     </w:p>
     <w:p>
       <w:pPr>
-        <w:pStyle w:val="Heading2"/>
+        <w:pStyle w:val="Ttulo2"/>
         <w:rPr>
           <w:rFonts w:ascii="Garamond" w:hAnsi="Garamond"/>
           <w:b/>
@@ -1209,14 +1056,7 @@
           <w:rFonts w:ascii="Garamond" w:hAnsi="Garamond"/>
           <w:lang w:val="en-US"/>
         </w:rPr>
-        <w:t>Des</w:t>
-      </w:r>
-      <w:r>
-        <w:rPr>
-          <w:rFonts w:ascii="Garamond" w:hAnsi="Garamond"/>
-          <w:lang w:val="en-US"/>
-        </w:rPr>
-        <w:t>tination: 1</w:t>
+        <w:t>Destination: 1</w:t>
       </w:r>
     </w:p>
     <w:p>
@@ -1253,7 +1093,7 @@
     </w:p>
     <w:p>
       <w:pPr>
-        <w:pStyle w:val="Heading2"/>
+        <w:pStyle w:val="Ttulo2"/>
         <w:rPr>
           <w:rFonts w:ascii="Garamond" w:hAnsi="Garamond"/>
           <w:b/>
@@ -1389,14 +1229,7 @@
           <w:rFonts w:ascii="Garamond" w:hAnsi="Garamond"/>
           <w:lang w:val="en-US"/>
         </w:rPr>
-        <w:t>No best alternative independent route foun</w:t>
-      </w:r>
-      <w:r>
-        <w:rPr>
-          <w:rFonts w:ascii="Garamond" w:hAnsi="Garamond"/>
-          <w:lang w:val="en-US"/>
-        </w:rPr>
-        <w:t>d.</w:t>
+        <w:t>No best alternative independent route found.</w:t>
       </w:r>
     </w:p>
     <w:p>
@@ -1455,7 +1288,7 @@
     </w:p>
     <w:p>
       <w:pPr>
-        <w:pStyle w:val="Heading1"/>
+        <w:pStyle w:val="Ttulo1"/>
         <w:rPr>
           <w:rFonts w:ascii="Garamond" w:hAnsi="Garamond"/>
           <w:b/>
@@ -1659,7 +1492,7 @@
     </w:p>
     <w:p>
       <w:pPr>
-        <w:pStyle w:val="Heading1"/>
+        <w:pStyle w:val="Ttulo1"/>
         <w:rPr>
           <w:rFonts w:ascii="Garamond" w:hAnsi="Garamond"/>
           <w:b/>
@@ -1681,7 +1514,7 @@
           <w:lang w:val="en-US"/>
         </w:rPr>
         <w:lastRenderedPageBreak/>
-        <w:t>6</w:t>
+        <w:t xml:space="preserve">6. </w:t>
       </w:r>
       <w:r>
         <w:rPr>
@@ -1691,7 +1524,7 @@
           <w:szCs w:val="24"/>
           <w:lang w:val="en-US"/>
         </w:rPr>
-        <w:t xml:space="preserve">. </w:t>
+        <w:t xml:space="preserve">Restricted (best) Route Planning Excluding specific </w:t>
       </w:r>
       <w:r>
         <w:rPr>
@@ -1701,16 +1534,6 @@
           <w:szCs w:val="24"/>
           <w:lang w:val="en-US"/>
         </w:rPr>
-        <w:t xml:space="preserve">Restricted (best) Route Planning Excluding specific </w:t>
-      </w:r>
-      <w:r>
-        <w:rPr>
-          <w:rFonts w:ascii="Garamond" w:hAnsi="Garamond"/>
-          <w:b/>
-          <w:sz w:val="24"/>
-          <w:szCs w:val="24"/>
-          <w:lang w:val="en-US"/>
-        </w:rPr>
         <w:t>segments</w:t>
       </w:r>
     </w:p>
@@ -1809,7 +1632,7 @@
     </w:p>
     <w:p>
       <w:pPr>
-        <w:pStyle w:val="Heading2"/>
+        <w:pStyle w:val="Ttulo2"/>
         <w:rPr>
           <w:rFonts w:ascii="Garamond" w:hAnsi="Garamond"/>
           <w:lang w:val="en-US"/>
@@ -1845,17 +1668,7 @@
           <w:szCs w:val="24"/>
           <w:lang w:val="en-US"/>
         </w:rPr>
-        <w:t xml:space="preserve">nodes and </w:t>
-      </w:r>
-      <w:r>
-        <w:rPr>
-          <w:rFonts w:ascii="Garamond" w:hAnsi="Garamond"/>
-          <w:b/>
-          <w:sz w:val="24"/>
-          <w:szCs w:val="24"/>
-          <w:lang w:val="en-US"/>
-        </w:rPr>
-        <w:t>segments</w:t>
+        <w:t>nodes and segments</w:t>
       </w:r>
     </w:p>
     <w:p>
@@ -1931,7 +1744,21 @@
           <w:rFonts w:ascii="Garamond" w:hAnsi="Garamond"/>
           <w:lang w:val="en-US"/>
         </w:rPr>
-        <w:t>Edges to exclude: (3,7)</w:t>
+        <w:t>Edges to exclude: (</w:t>
+      </w:r>
+      <w:r>
+        <w:rPr>
+          <w:rFonts w:ascii="Garamond" w:hAnsi="Garamond"/>
+          <w:lang w:val="en-US"/>
+        </w:rPr>
+        <w:t>4</w:t>
+      </w:r>
+      <w:r>
+        <w:rPr>
+          <w:rFonts w:ascii="Garamond" w:hAnsi="Garamond"/>
+          <w:lang w:val="en-US"/>
+        </w:rPr>
+        <w:t>,7)</w:t>
       </w:r>
     </w:p>
     <w:p>
@@ -1968,7 +1795,7 @@
     </w:p>
     <w:p>
       <w:pPr>
-        <w:pStyle w:val="Heading2"/>
+        <w:pStyle w:val="Ttulo2"/>
         <w:rPr>
           <w:rFonts w:ascii="Garamond" w:hAnsi="Garamond"/>
           <w:lang w:val="en-US"/>
@@ -2024,27 +1851,7 @@
           <w:szCs w:val="24"/>
           <w:lang w:val="en-US"/>
         </w:rPr>
-        <w:t>nodes and</w:t>
-      </w:r>
-      <w:r>
-        <w:rPr>
-          <w:rFonts w:ascii="Garamond" w:hAnsi="Garamond"/>
-          <w:b/>
-          <w:sz w:val="24"/>
-          <w:szCs w:val="24"/>
-          <w:lang w:val="en-US"/>
-        </w:rPr>
-        <w:t>/or</w:t>
-      </w:r>
-      <w:r>
-        <w:rPr>
-          <w:rFonts w:ascii="Garamond" w:hAnsi="Garamond"/>
-          <w:b/>
-          <w:sz w:val="24"/>
-          <w:szCs w:val="24"/>
-          <w:lang w:val="en-US"/>
-        </w:rPr>
-        <w:t xml:space="preserve"> segments</w:t>
+        <w:t>nodes and/or segments</w:t>
       </w:r>
     </w:p>
     <w:p>
@@ -2105,14 +1912,7 @@
           <w:rFonts w:ascii="Garamond" w:hAnsi="Garamond"/>
           <w:lang w:val="en-US"/>
         </w:rPr>
-        <w:t>Node</w:t>
-      </w:r>
-      <w:r>
-        <w:rPr>
-          <w:rFonts w:ascii="Garamond" w:hAnsi="Garamond"/>
-          <w:lang w:val="en-US"/>
-        </w:rPr>
-        <w:t>s to exclude: None</w:t>
+        <w:t>Nodes to exclude: None</w:t>
       </w:r>
     </w:p>
     <w:p>
@@ -2232,7 +2032,7 @@
     </w:p>
     <w:p>
       <w:pPr>
-        <w:pStyle w:val="Heading1"/>
+        <w:pStyle w:val="Ttulo1"/>
         <w:rPr>
           <w:rFonts w:ascii="Garamond" w:hAnsi="Garamond"/>
           <w:b/>
@@ -2427,14 +2227,7 @@
           <w:rFonts w:ascii="Garamond" w:hAnsi="Garamond"/>
           <w:lang w:val="en-US"/>
         </w:rPr>
-        <w:t xml:space="preserve">Walking Route: [3, 5] </w:t>
-      </w:r>
-      <w:r>
-        <w:rPr>
-          <w:rFonts w:ascii="Garamond" w:hAnsi="Garamond"/>
-          <w:lang w:val="en-US"/>
-        </w:rPr>
-        <w:t>(Time: 10 minutes)</w:t>
+        <w:t>Walking Route: [3, 5] (Time: 10 minutes)</w:t>
       </w:r>
     </w:p>
     <w:p>
@@ -2463,7 +2256,7 @@
     </w:p>
     <w:p>
       <w:pPr>
-        <w:pStyle w:val="Heading2"/>
+        <w:pStyle w:val="Ttulo2"/>
         <w:rPr>
           <w:rFonts w:ascii="Garamond" w:hAnsi="Garamond"/>
           <w:lang w:val="en-US"/>
@@ -2474,31 +2267,22 @@
     </w:p>
     <w:p>
       <w:pPr>
-        <w:pStyle w:val="Heading1"/>
-        <w:rPr>
-          <w:rFonts w:ascii="Garamond" w:hAnsi="Garamond"/>
-          <w:b/>
-          <w:sz w:val="24"/>
-          <w:lang w:val="en-US"/>
-        </w:rPr>
-      </w:pPr>
-      <w:r>
-        <w:rPr>
-          <w:rFonts w:ascii="Garamond" w:hAnsi="Garamond"/>
-          <w:b/>
-          <w:sz w:val="24"/>
-          <w:lang w:val="en-US"/>
-        </w:rPr>
-        <w:t>9</w:t>
-      </w:r>
-      <w:r>
-        <w:rPr>
-          <w:rFonts w:ascii="Garamond" w:hAnsi="Garamond"/>
-          <w:b/>
-          <w:sz w:val="24"/>
-          <w:lang w:val="en-US"/>
-        </w:rPr>
-        <w:t xml:space="preserve">. </w:t>
+        <w:pStyle w:val="Ttulo1"/>
+        <w:rPr>
+          <w:rFonts w:ascii="Garamond" w:hAnsi="Garamond"/>
+          <w:b/>
+          <w:sz w:val="24"/>
+          <w:lang w:val="en-US"/>
+        </w:rPr>
+      </w:pPr>
+      <w:r>
+        <w:rPr>
+          <w:rFonts w:ascii="Garamond" w:hAnsi="Garamond"/>
+          <w:b/>
+          <w:sz w:val="24"/>
+          <w:lang w:val="en-US"/>
+        </w:rPr>
+        <w:t xml:space="preserve">9. </w:t>
       </w:r>
       <w:r>
         <w:rPr>
@@ -2705,7 +2489,7 @@
     </w:p>
     <w:p>
       <w:pPr>
-        <w:pStyle w:val="Heading2"/>
+        <w:pStyle w:val="Ttulo2"/>
         <w:jc w:val="center"/>
         <w:rPr>
           <w:rFonts w:ascii="Garamond" w:hAnsi="Garamond"/>
@@ -2804,14 +2588,7 @@
           <w:rFonts w:ascii="Garamond" w:hAnsi="Garamond"/>
           <w:lang w:val="en-US"/>
         </w:rPr>
-        <w:t>Max. Walki</w:t>
-      </w:r>
-      <w:r>
-        <w:rPr>
-          <w:rFonts w:ascii="Garamond" w:hAnsi="Garamond"/>
-          <w:lang w:val="en-US"/>
-        </w:rPr>
-        <w:t>ng Time: 10</w:t>
+        <w:t>Max. Walking Time: 10</w:t>
       </w:r>
     </w:p>
     <w:p>
@@ -2890,7 +2667,7 @@
     </w:p>
     <w:p>
       <w:pPr>
-        <w:pStyle w:val="Heading2"/>
+        <w:pStyle w:val="Ttulo2"/>
         <w:jc w:val="center"/>
         <w:rPr>
           <w:rFonts w:ascii="Garamond" w:hAnsi="Garamond"/>
@@ -3071,20 +2848,12 @@
           <w:u w:val="single"/>
           <w:lang w:val="en-US"/>
         </w:rPr>
-        <w:t xml:space="preserve"> of 5 minu</w:t>
-      </w:r>
-      <w:r>
-        <w:rPr>
-          <w:rFonts w:ascii="Garamond" w:hAnsi="Garamond"/>
-          <w:u w:val="single"/>
-          <w:lang w:val="en-US"/>
-        </w:rPr>
-        <w:t>tes.</w:t>
-      </w:r>
-    </w:p>
-    <w:p>
-      <w:pPr>
-        <w:pStyle w:val="Heading1"/>
+        <w:t xml:space="preserve"> of 5 minutes.</w:t>
+      </w:r>
+    </w:p>
+    <w:p>
+      <w:pPr>
+        <w:pStyle w:val="Ttulo1"/>
         <w:rPr>
           <w:rFonts w:ascii="Garamond" w:hAnsi="Garamond"/>
           <w:b/>
@@ -3356,7 +3125,7 @@
     </w:p>
     <w:p>
       <w:pPr>
-        <w:pStyle w:val="Heading1"/>
+        <w:pStyle w:val="Ttulo1"/>
         <w:rPr>
           <w:rFonts w:ascii="Garamond" w:hAnsi="Garamond"/>
           <w:b/>
@@ -3572,17 +3341,7 @@
           <w:b/>
           <w:lang w:val="en-US"/>
         </w:rPr>
-        <w:t>13</w:t>
-      </w:r>
-      <w:bookmarkStart w:id="17" w:name="_GoBack"/>
-      <w:bookmarkEnd w:id="17"/>
-      <w:r>
-        <w:rPr>
-          <w:rFonts w:ascii="Garamond" w:hAnsi="Garamond"/>
-          <w:b/>
-          <w:lang w:val="en-US"/>
-        </w:rPr>
-        <w:t xml:space="preserve">. </w:t>
+        <w:t xml:space="preserve">13. </w:t>
       </w:r>
       <w:r>
         <w:rPr>
@@ -3605,14 +3364,7 @@
           <w:rFonts w:ascii="Garamond" w:hAnsi="Garamond"/>
           <w:lang w:val="en-US"/>
         </w:rPr>
-        <w:t xml:space="preserve">-&gt; </w:t>
-      </w:r>
-      <w:r>
-        <w:rPr>
-          <w:rFonts w:ascii="Garamond" w:hAnsi="Garamond"/>
-          <w:lang w:val="en-US"/>
-        </w:rPr>
-        <w:t>Consider max. walking time up to 10 minutes</w:t>
+        <w:t>-&gt; Consider max. walking time up to 10 minutes</w:t>
       </w:r>
     </w:p>
     <w:p>
@@ -3714,7 +3466,7 @@
 </file>
 
 <file path=word/endnotes.xml><?xml version="1.0" encoding="utf-8"?>
-<w:endnotes xmlns:wpc="http://schemas.microsoft.com/office/word/2010/wordprocessingCanvas" xmlns:cx="http://schemas.microsoft.com/office/drawing/2014/chartex" xmlns:cx1="http://schemas.microsoft.com/office/drawing/2015/9/8/chartex" xmlns:cx2="http://schemas.microsoft.com/office/drawing/2015/10/21/chartex" xmlns:cx3="http://schemas.microsoft.com/office/drawing/2016/5/9/chartex" xmlns:cx4="http://schemas.microsoft.com/office/drawing/2016/5/10/chartex" xmlns:cx5="http://schemas.microsoft.com/office/drawing/2016/5/11/chartex" xmlns:cx6="http://schemas.microsoft.com/office/drawing/2016/5/12/chartex" xmlns:cx7="http://schemas.microsoft.com/office/drawing/2016/5/13/chartex" xmlns:cx8="http://schemas.microsoft.com/office/drawing/2016/5/14/chartex" xmlns:mc="http://schemas.openxmlformats.org/markup-compatibility/2006" xmlns:aink="http://schemas.microsoft.com/office/drawing/2016/ink" xmlns:am3d="http://schemas.microsoft.com/office/drawing/2017/model3d" xmlns:o="urn:schemas-microsoft-com:office:office" xmlns:r="http://schemas.openxmlformats.org/officeDocument/2006/relationships" xmlns:m="http://schemas.openxmlformats.org/officeDocument/2006/math" xmlns:v="urn:schemas-microsoft-com:vml" xmlns:wp14="http://schemas.microsoft.com/office/word/2010/wordprocessingDrawing" xmlns:wp="http://schemas.openxmlformats.org/drawingml/2006/wordprocessingDrawing" xmlns:w10="urn:schemas-microsoft-com:office:word" xmlns:w="http://schemas.openxmlformats.org/wordprocessingml/2006/main" xmlns:w14="http://schemas.microsoft.com/office/word/2010/wordml" xmlns:w15="http://schemas.microsoft.com/office/word/2012/wordml" xmlns:w16cid="http://schemas.microsoft.com/office/word/2016/wordml/cid" xmlns:w16se="http://schemas.microsoft.com/office/word/2015/wordml/symex" xmlns:wpg="http://schemas.microsoft.com/office/word/2010/wordprocessingGroup" xmlns:wpi="http://schemas.microsoft.com/office/word/2010/wordprocessingInk" xmlns:wne="http://schemas.microsoft.com/office/word/2006/wordml" xmlns:wps="http://schemas.microsoft.com/office/word/2010/wordprocessingShape" mc:Ignorable="w14 w15 w16se w16cid wp14">
+<w:endnotes xmlns:wpc="http://schemas.microsoft.com/office/word/2010/wordprocessingCanvas" xmlns:cx="http://schemas.microsoft.com/office/drawing/2014/chartex" xmlns:cx1="http://schemas.microsoft.com/office/drawing/2015/9/8/chartex" xmlns:cx2="http://schemas.microsoft.com/office/drawing/2015/10/21/chartex" xmlns:cx3="http://schemas.microsoft.com/office/drawing/2016/5/9/chartex" xmlns:cx4="http://schemas.microsoft.com/office/drawing/2016/5/10/chartex" xmlns:cx5="http://schemas.microsoft.com/office/drawing/2016/5/11/chartex" xmlns:cx6="http://schemas.microsoft.com/office/drawing/2016/5/12/chartex" xmlns:cx7="http://schemas.microsoft.com/office/drawing/2016/5/13/chartex" xmlns:cx8="http://schemas.microsoft.com/office/drawing/2016/5/14/chartex" xmlns:mc="http://schemas.openxmlformats.org/markup-compatibility/2006" xmlns:aink="http://schemas.microsoft.com/office/drawing/2016/ink" xmlns:am3d="http://schemas.microsoft.com/office/drawing/2017/model3d" xmlns:o="urn:schemas-microsoft-com:office:office" xmlns:oel="http://schemas.microsoft.com/office/2019/extlst" xmlns:r="http://schemas.openxmlformats.org/officeDocument/2006/relationships" xmlns:m="http://schemas.openxmlformats.org/officeDocument/2006/math" xmlns:v="urn:schemas-microsoft-com:vml" xmlns:wp14="http://schemas.microsoft.com/office/word/2010/wordprocessingDrawing" xmlns:wp="http://schemas.openxmlformats.org/drawingml/2006/wordprocessingDrawing" xmlns:w10="urn:schemas-microsoft-com:office:word" xmlns:w="http://schemas.openxmlformats.org/wordprocessingml/2006/main" xmlns:w14="http://schemas.microsoft.com/office/word/2010/wordml" xmlns:w15="http://schemas.microsoft.com/office/word/2012/wordml" xmlns:w16cex="http://schemas.microsoft.com/office/word/2018/wordml/cex" xmlns:w16cid="http://schemas.microsoft.com/office/word/2016/wordml/cid" xmlns:w16="http://schemas.microsoft.com/office/word/2018/wordml" xmlns:w16du="http://schemas.microsoft.com/office/word/2023/wordml/word16du" xmlns:w16sdtdh="http://schemas.microsoft.com/office/word/2020/wordml/sdtdatahash" xmlns:w16sdtfl="http://schemas.microsoft.com/office/word/2024/wordml/sdtformatlock" xmlns:w16se="http://schemas.microsoft.com/office/word/2015/wordml/symex" xmlns:wpg="http://schemas.microsoft.com/office/word/2010/wordprocessingGroup" xmlns:wpi="http://schemas.microsoft.com/office/word/2010/wordprocessingInk" xmlns:wne="http://schemas.microsoft.com/office/word/2006/wordml" xmlns:wps="http://schemas.microsoft.com/office/word/2010/wordprocessingShape" mc:Ignorable="w14 w15 w16se w16cid w16 w16cex w16sdtdh w16sdtfl w16du wp14">
   <w:endnote w:type="separator" w:id="-1">
     <w:p>
       <w:pPr>
@@ -3739,7 +3491,7 @@
 </file>
 
 <file path=word/footer1.xml><?xml version="1.0" encoding="utf-8"?>
-<w:ftr xmlns:wpc="http://schemas.microsoft.com/office/word/2010/wordprocessingCanvas" xmlns:cx="http://schemas.microsoft.com/office/drawing/2014/chartex" xmlns:cx1="http://schemas.microsoft.com/office/drawing/2015/9/8/chartex" xmlns:cx2="http://schemas.microsoft.com/office/drawing/2015/10/21/chartex" xmlns:cx3="http://schemas.microsoft.com/office/drawing/2016/5/9/chartex" xmlns:cx4="http://schemas.microsoft.com/office/drawing/2016/5/10/chartex" xmlns:cx5="http://schemas.microsoft.com/office/drawing/2016/5/11/chartex" xmlns:cx6="http://schemas.microsoft.com/office/drawing/2016/5/12/chartex" xmlns:cx7="http://schemas.microsoft.com/office/drawing/2016/5/13/chartex" xmlns:cx8="http://schemas.microsoft.com/office/drawing/2016/5/14/chartex" xmlns:mc="http://schemas.openxmlformats.org/markup-compatibility/2006" xmlns:aink="http://schemas.microsoft.com/office/drawing/2016/ink" xmlns:am3d="http://schemas.microsoft.com/office/drawing/2017/model3d" xmlns:o="urn:schemas-microsoft-com:office:office" xmlns:r="http://schemas.openxmlformats.org/officeDocument/2006/relationships" xmlns:m="http://schemas.openxmlformats.org/officeDocument/2006/math" xmlns:v="urn:schemas-microsoft-com:vml" xmlns:wp14="http://schemas.microsoft.com/office/word/2010/wordprocessingDrawing" xmlns:wp="http://schemas.openxmlformats.org/drawingml/2006/wordprocessingDrawing" xmlns:w10="urn:schemas-microsoft-com:office:word" xmlns:w="http://schemas.openxmlformats.org/wordprocessingml/2006/main" xmlns:w14="http://schemas.microsoft.com/office/word/2010/wordml" xmlns:w15="http://schemas.microsoft.com/office/word/2012/wordml" xmlns:w16cid="http://schemas.microsoft.com/office/word/2016/wordml/cid" xmlns:w16se="http://schemas.microsoft.com/office/word/2015/wordml/symex" xmlns:wpg="http://schemas.microsoft.com/office/word/2010/wordprocessingGroup" xmlns:wpi="http://schemas.microsoft.com/office/word/2010/wordprocessingInk" xmlns:wne="http://schemas.microsoft.com/office/word/2006/wordml" xmlns:wps="http://schemas.microsoft.com/office/word/2010/wordprocessingShape" mc:Ignorable="w14 w15 w16se w16cid wp14">
+<w:ftr xmlns:wpc="http://schemas.microsoft.com/office/word/2010/wordprocessingCanvas" xmlns:cx="http://schemas.microsoft.com/office/drawing/2014/chartex" xmlns:cx1="http://schemas.microsoft.com/office/drawing/2015/9/8/chartex" xmlns:cx2="http://schemas.microsoft.com/office/drawing/2015/10/21/chartex" xmlns:cx3="http://schemas.microsoft.com/office/drawing/2016/5/9/chartex" xmlns:cx4="http://schemas.microsoft.com/office/drawing/2016/5/10/chartex" xmlns:cx5="http://schemas.microsoft.com/office/drawing/2016/5/11/chartex" xmlns:cx6="http://schemas.microsoft.com/office/drawing/2016/5/12/chartex" xmlns:cx7="http://schemas.microsoft.com/office/drawing/2016/5/13/chartex" xmlns:cx8="http://schemas.microsoft.com/office/drawing/2016/5/14/chartex" xmlns:mc="http://schemas.openxmlformats.org/markup-compatibility/2006" xmlns:aink="http://schemas.microsoft.com/office/drawing/2016/ink" xmlns:am3d="http://schemas.microsoft.com/office/drawing/2017/model3d" xmlns:o="urn:schemas-microsoft-com:office:office" xmlns:oel="http://schemas.microsoft.com/office/2019/extlst" xmlns:r="http://schemas.openxmlformats.org/officeDocument/2006/relationships" xmlns:m="http://schemas.openxmlformats.org/officeDocument/2006/math" xmlns:v="urn:schemas-microsoft-com:vml" xmlns:wp14="http://schemas.microsoft.com/office/word/2010/wordprocessingDrawing" xmlns:wp="http://schemas.openxmlformats.org/drawingml/2006/wordprocessingDrawing" xmlns:w10="urn:schemas-microsoft-com:office:word" xmlns:w="http://schemas.openxmlformats.org/wordprocessingml/2006/main" xmlns:w14="http://schemas.microsoft.com/office/word/2010/wordml" xmlns:w15="http://schemas.microsoft.com/office/word/2012/wordml" xmlns:w16cex="http://schemas.microsoft.com/office/word/2018/wordml/cex" xmlns:w16cid="http://schemas.microsoft.com/office/word/2016/wordml/cid" xmlns:w16="http://schemas.microsoft.com/office/word/2018/wordml" xmlns:w16du="http://schemas.microsoft.com/office/word/2023/wordml/word16du" xmlns:w16sdtdh="http://schemas.microsoft.com/office/word/2020/wordml/sdtdatahash" xmlns:w16sdtfl="http://schemas.microsoft.com/office/word/2024/wordml/sdtformatlock" xmlns:w16se="http://schemas.microsoft.com/office/word/2015/wordml/symex" xmlns:wpg="http://schemas.microsoft.com/office/word/2010/wordprocessingGroup" xmlns:wpi="http://schemas.microsoft.com/office/word/2010/wordprocessingInk" xmlns:wne="http://schemas.microsoft.com/office/word/2006/wordml" xmlns:wps="http://schemas.microsoft.com/office/word/2010/wordprocessingShape" mc:Ignorable="w14 w15 w16se w16cid w16 w16cex w16sdtdh w16sdtfl w16du wp14">
   <w:p>
     <w:pPr>
       <w:pBdr>
@@ -3790,27 +3542,18 @@
         <w:i/>
         <w:sz w:val="20"/>
         <w:szCs w:val="20"/>
+        <w:lang w:val="en-US"/>
       </w:rPr>
     </w:pPr>
-    <w:proofErr w:type="spellStart"/>
     <w:r>
       <w:rPr>
         <w:rFonts w:ascii="Garamond" w:eastAsia="Garamond" w:hAnsi="Garamond" w:cs="Garamond"/>
         <w:i/>
         <w:sz w:val="20"/>
         <w:szCs w:val="20"/>
+        <w:lang w:val="en-US"/>
       </w:rPr>
-      <w:t>Programming</w:t>
-    </w:r>
-    <w:proofErr w:type="spellEnd"/>
-    <w:r>
-      <w:rPr>
-        <w:rFonts w:ascii="Garamond" w:eastAsia="Garamond" w:hAnsi="Garamond" w:cs="Garamond"/>
-        <w:i/>
-        <w:sz w:val="20"/>
-        <w:szCs w:val="20"/>
-      </w:rPr>
-      <w:t xml:space="preserve"> Project I </w:t>
+      <w:t>Programming Project I - Simples Small Examples</w:t>
     </w:r>
     <w:r>
       <w:rPr>
@@ -3818,46 +3561,7 @@
         <w:i/>
         <w:sz w:val="20"/>
         <w:szCs w:val="20"/>
-      </w:rPr>
-      <w:t xml:space="preserve">- Simples </w:t>
-    </w:r>
-    <w:proofErr w:type="spellStart"/>
-    <w:r>
-      <w:rPr>
-        <w:rFonts w:ascii="Garamond" w:eastAsia="Garamond" w:hAnsi="Garamond" w:cs="Garamond"/>
-        <w:i/>
-        <w:sz w:val="20"/>
-        <w:szCs w:val="20"/>
-      </w:rPr>
-      <w:t>Small</w:t>
-    </w:r>
-    <w:proofErr w:type="spellEnd"/>
-    <w:r>
-      <w:rPr>
-        <w:rFonts w:ascii="Garamond" w:eastAsia="Garamond" w:hAnsi="Garamond" w:cs="Garamond"/>
-        <w:i/>
-        <w:sz w:val="20"/>
-        <w:szCs w:val="20"/>
-      </w:rPr>
-      <w:t xml:space="preserve"> </w:t>
-    </w:r>
-    <w:proofErr w:type="spellStart"/>
-    <w:r>
-      <w:rPr>
-        <w:rFonts w:ascii="Garamond" w:eastAsia="Garamond" w:hAnsi="Garamond" w:cs="Garamond"/>
-        <w:i/>
-        <w:sz w:val="20"/>
-        <w:szCs w:val="20"/>
-      </w:rPr>
-      <w:t>Examples</w:t>
-    </w:r>
-    <w:proofErr w:type="spellEnd"/>
-    <w:r>
-      <w:rPr>
-        <w:rFonts w:ascii="Garamond" w:eastAsia="Garamond" w:hAnsi="Garamond" w:cs="Garamond"/>
-        <w:i/>
-        <w:sz w:val="20"/>
-        <w:szCs w:val="20"/>
+        <w:lang w:val="en-US"/>
       </w:rPr>
       <w:tab/>
     </w:r>
@@ -3867,6 +3571,7 @@
         <w:i/>
         <w:sz w:val="20"/>
         <w:szCs w:val="20"/>
+        <w:lang w:val="en-US"/>
       </w:rPr>
       <w:tab/>
     </w:r>
@@ -3876,6 +3581,7 @@
         <w:i/>
         <w:sz w:val="20"/>
         <w:szCs w:val="20"/>
+        <w:lang w:val="en-US"/>
       </w:rPr>
       <w:tab/>
     </w:r>
@@ -3885,6 +3591,7 @@
         <w:i/>
         <w:sz w:val="20"/>
         <w:szCs w:val="20"/>
+        <w:lang w:val="en-US"/>
       </w:rPr>
       <w:tab/>
     </w:r>
@@ -3894,6 +3601,7 @@
         <w:i/>
         <w:sz w:val="20"/>
         <w:szCs w:val="20"/>
+        <w:lang w:val="en-US"/>
       </w:rPr>
       <w:tab/>
     </w:r>
@@ -3903,6 +3611,7 @@
         <w:i/>
         <w:sz w:val="20"/>
         <w:szCs w:val="20"/>
+        <w:lang w:val="en-US"/>
       </w:rPr>
       <w:tab/>
     </w:r>
@@ -3912,6 +3621,7 @@
         <w:i/>
         <w:sz w:val="20"/>
         <w:szCs w:val="20"/>
+        <w:lang w:val="en-US"/>
       </w:rPr>
       <w:tab/>
     </w:r>
@@ -3921,6 +3631,7 @@
         <w:i/>
         <w:sz w:val="20"/>
         <w:szCs w:val="20"/>
+        <w:lang w:val="en-US"/>
       </w:rPr>
       <w:tab/>
       <w:t xml:space="preserve">             </w:t>
@@ -3938,6 +3649,7 @@
         <w:rFonts w:ascii="Garamond" w:eastAsia="Garamond" w:hAnsi="Garamond" w:cs="Garamond"/>
         <w:sz w:val="20"/>
         <w:szCs w:val="20"/>
+        <w:lang w:val="en-US"/>
       </w:rPr>
       <w:instrText>PAGE</w:instrText>
     </w:r>
@@ -3954,6 +3666,7 @@
         <w:rFonts w:ascii="Garamond" w:eastAsia="Garamond" w:hAnsi="Garamond" w:cs="Garamond"/>
         <w:sz w:val="20"/>
         <w:szCs w:val="20"/>
+        <w:lang w:val="en-US"/>
       </w:rPr>
       <w:t>1</w:t>
     </w:r>
@@ -3970,26 +3683,9 @@
         <w:rFonts w:ascii="Garamond" w:eastAsia="Garamond" w:hAnsi="Garamond" w:cs="Garamond"/>
         <w:sz w:val="20"/>
         <w:szCs w:val="20"/>
+        <w:lang w:val="en-US"/>
       </w:rPr>
-      <w:t xml:space="preserve"> </w:t>
-    </w:r>
-    <w:proofErr w:type="spellStart"/>
-    <w:r>
-      <w:rPr>
-        <w:rFonts w:ascii="Garamond" w:eastAsia="Garamond" w:hAnsi="Garamond" w:cs="Garamond"/>
-        <w:sz w:val="20"/>
-        <w:szCs w:val="20"/>
-      </w:rPr>
-      <w:t>of</w:t>
-    </w:r>
-    <w:proofErr w:type="spellEnd"/>
-    <w:r>
-      <w:rPr>
-        <w:rFonts w:ascii="Garamond" w:eastAsia="Garamond" w:hAnsi="Garamond" w:cs="Garamond"/>
-        <w:sz w:val="20"/>
-        <w:szCs w:val="20"/>
-      </w:rPr>
-      <w:t xml:space="preserve"> </w:t>
+      <w:t xml:space="preserve"> of </w:t>
     </w:r>
     <w:r>
       <w:rPr>
@@ -4004,6 +3700,7 @@
         <w:rFonts w:ascii="Garamond" w:eastAsia="Garamond" w:hAnsi="Garamond" w:cs="Garamond"/>
         <w:sz w:val="20"/>
         <w:szCs w:val="20"/>
+        <w:lang w:val="en-US"/>
       </w:rPr>
       <w:instrText>NUMPAGES</w:instrText>
     </w:r>
@@ -4020,6 +3717,7 @@
         <w:rFonts w:ascii="Garamond" w:eastAsia="Garamond" w:hAnsi="Garamond" w:cs="Garamond"/>
         <w:sz w:val="20"/>
         <w:szCs w:val="20"/>
+        <w:lang w:val="en-US"/>
       </w:rPr>
       <w:t>7</w:t>
     </w:r>
@@ -4036,7 +3734,7 @@
 </file>
 
 <file path=word/footnotes.xml><?xml version="1.0" encoding="utf-8"?>
-<w:footnotes xmlns:wpc="http://schemas.microsoft.com/office/word/2010/wordprocessingCanvas" xmlns:cx="http://schemas.microsoft.com/office/drawing/2014/chartex" xmlns:cx1="http://schemas.microsoft.com/office/drawing/2015/9/8/chartex" xmlns:cx2="http://schemas.microsoft.com/office/drawing/2015/10/21/chartex" xmlns:cx3="http://schemas.microsoft.com/office/drawing/2016/5/9/chartex" xmlns:cx4="http://schemas.microsoft.com/office/drawing/2016/5/10/chartex" xmlns:cx5="http://schemas.microsoft.com/office/drawing/2016/5/11/chartex" xmlns:cx6="http://schemas.microsoft.com/office/drawing/2016/5/12/chartex" xmlns:cx7="http://schemas.microsoft.com/office/drawing/2016/5/13/chartex" xmlns:cx8="http://schemas.microsoft.com/office/drawing/2016/5/14/chartex" xmlns:mc="http://schemas.openxmlformats.org/markup-compatibility/2006" xmlns:aink="http://schemas.microsoft.com/office/drawing/2016/ink" xmlns:am3d="http://schemas.microsoft.com/office/drawing/2017/model3d" xmlns:o="urn:schemas-microsoft-com:office:office" xmlns:r="http://schemas.openxmlformats.org/officeDocument/2006/relationships" xmlns:m="http://schemas.openxmlformats.org/officeDocument/2006/math" xmlns:v="urn:schemas-microsoft-com:vml" xmlns:wp14="http://schemas.microsoft.com/office/word/2010/wordprocessingDrawing" xmlns:wp="http://schemas.openxmlformats.org/drawingml/2006/wordprocessingDrawing" xmlns:w10="urn:schemas-microsoft-com:office:word" xmlns:w="http://schemas.openxmlformats.org/wordprocessingml/2006/main" xmlns:w14="http://schemas.microsoft.com/office/word/2010/wordml" xmlns:w15="http://schemas.microsoft.com/office/word/2012/wordml" xmlns:w16cid="http://schemas.microsoft.com/office/word/2016/wordml/cid" xmlns:w16se="http://schemas.microsoft.com/office/word/2015/wordml/symex" xmlns:wpg="http://schemas.microsoft.com/office/word/2010/wordprocessingGroup" xmlns:wpi="http://schemas.microsoft.com/office/word/2010/wordprocessingInk" xmlns:wne="http://schemas.microsoft.com/office/word/2006/wordml" xmlns:wps="http://schemas.microsoft.com/office/word/2010/wordprocessingShape" mc:Ignorable="w14 w15 w16se w16cid wp14">
+<w:footnotes xmlns:wpc="http://schemas.microsoft.com/office/word/2010/wordprocessingCanvas" xmlns:cx="http://schemas.microsoft.com/office/drawing/2014/chartex" xmlns:cx1="http://schemas.microsoft.com/office/drawing/2015/9/8/chartex" xmlns:cx2="http://schemas.microsoft.com/office/drawing/2015/10/21/chartex" xmlns:cx3="http://schemas.microsoft.com/office/drawing/2016/5/9/chartex" xmlns:cx4="http://schemas.microsoft.com/office/drawing/2016/5/10/chartex" xmlns:cx5="http://schemas.microsoft.com/office/drawing/2016/5/11/chartex" xmlns:cx6="http://schemas.microsoft.com/office/drawing/2016/5/12/chartex" xmlns:cx7="http://schemas.microsoft.com/office/drawing/2016/5/13/chartex" xmlns:cx8="http://schemas.microsoft.com/office/drawing/2016/5/14/chartex" xmlns:mc="http://schemas.openxmlformats.org/markup-compatibility/2006" xmlns:aink="http://schemas.microsoft.com/office/drawing/2016/ink" xmlns:am3d="http://schemas.microsoft.com/office/drawing/2017/model3d" xmlns:o="urn:schemas-microsoft-com:office:office" xmlns:oel="http://schemas.microsoft.com/office/2019/extlst" xmlns:r="http://schemas.openxmlformats.org/officeDocument/2006/relationships" xmlns:m="http://schemas.openxmlformats.org/officeDocument/2006/math" xmlns:v="urn:schemas-microsoft-com:vml" xmlns:wp14="http://schemas.microsoft.com/office/word/2010/wordprocessingDrawing" xmlns:wp="http://schemas.openxmlformats.org/drawingml/2006/wordprocessingDrawing" xmlns:w10="urn:schemas-microsoft-com:office:word" xmlns:w="http://schemas.openxmlformats.org/wordprocessingml/2006/main" xmlns:w14="http://schemas.microsoft.com/office/word/2010/wordml" xmlns:w15="http://schemas.microsoft.com/office/word/2012/wordml" xmlns:w16cex="http://schemas.microsoft.com/office/word/2018/wordml/cex" xmlns:w16cid="http://schemas.microsoft.com/office/word/2016/wordml/cid" xmlns:w16="http://schemas.microsoft.com/office/word/2018/wordml" xmlns:w16du="http://schemas.microsoft.com/office/word/2023/wordml/word16du" xmlns:w16sdtdh="http://schemas.microsoft.com/office/word/2020/wordml/sdtdatahash" xmlns:w16sdtfl="http://schemas.microsoft.com/office/word/2024/wordml/sdtformatlock" xmlns:w16se="http://schemas.microsoft.com/office/word/2015/wordml/symex" xmlns:wpg="http://schemas.microsoft.com/office/word/2010/wordprocessingGroup" xmlns:wpi="http://schemas.microsoft.com/office/word/2010/wordprocessingInk" xmlns:wne="http://schemas.microsoft.com/office/word/2006/wordml" xmlns:wps="http://schemas.microsoft.com/office/word/2010/wordprocessingShape" mc:Ignorable="w14 w15 w16se w16cid w16 w16cex w16sdtdh w16sdtfl w16du wp14">
   <w:footnote w:type="separator" w:id="-1">
     <w:p>
       <w:pPr>
@@ -4061,17 +3759,17 @@
 </file>
 
 <file path=word/header1.xml><?xml version="1.0" encoding="utf-8"?>
-<w:hdr xmlns:wpc="http://schemas.microsoft.com/office/word/2010/wordprocessingCanvas" xmlns:cx="http://schemas.microsoft.com/office/drawing/2014/chartex" xmlns:cx1="http://schemas.microsoft.com/office/drawing/2015/9/8/chartex" xmlns:cx2="http://schemas.microsoft.com/office/drawing/2015/10/21/chartex" xmlns:cx3="http://schemas.microsoft.com/office/drawing/2016/5/9/chartex" xmlns:cx4="http://schemas.microsoft.com/office/drawing/2016/5/10/chartex" xmlns:cx5="http://schemas.microsoft.com/office/drawing/2016/5/11/chartex" xmlns:cx6="http://schemas.microsoft.com/office/drawing/2016/5/12/chartex" xmlns:cx7="http://schemas.microsoft.com/office/drawing/2016/5/13/chartex" xmlns:cx8="http://schemas.microsoft.com/office/drawing/2016/5/14/chartex" xmlns:mc="http://schemas.openxmlformats.org/markup-compatibility/2006" xmlns:aink="http://schemas.microsoft.com/office/drawing/2016/ink" xmlns:am3d="http://schemas.microsoft.com/office/drawing/2017/model3d" xmlns:o="urn:schemas-microsoft-com:office:office" xmlns:r="http://schemas.openxmlformats.org/officeDocument/2006/relationships" xmlns:m="http://schemas.openxmlformats.org/officeDocument/2006/math" xmlns:v="urn:schemas-microsoft-com:vml" xmlns:wp14="http://schemas.microsoft.com/office/word/2010/wordprocessingDrawing" xmlns:wp="http://schemas.openxmlformats.org/drawingml/2006/wordprocessingDrawing" xmlns:w10="urn:schemas-microsoft-com:office:word" xmlns:w="http://schemas.openxmlformats.org/wordprocessingml/2006/main" xmlns:w14="http://schemas.microsoft.com/office/word/2010/wordml" xmlns:w15="http://schemas.microsoft.com/office/word/2012/wordml" xmlns:w16cid="http://schemas.microsoft.com/office/word/2016/wordml/cid" xmlns:w16se="http://schemas.microsoft.com/office/word/2015/wordml/symex" xmlns:wpg="http://schemas.microsoft.com/office/word/2010/wordprocessingGroup" xmlns:wpi="http://schemas.microsoft.com/office/word/2010/wordprocessingInk" xmlns:wne="http://schemas.microsoft.com/office/word/2006/wordml" xmlns:wps="http://schemas.microsoft.com/office/word/2010/wordprocessingShape" mc:Ignorable="w14 w15 w16se w16cid wp14">
+<w:hdr xmlns:wpc="http://schemas.microsoft.com/office/word/2010/wordprocessingCanvas" xmlns:cx="http://schemas.microsoft.com/office/drawing/2014/chartex" xmlns:cx1="http://schemas.microsoft.com/office/drawing/2015/9/8/chartex" xmlns:cx2="http://schemas.microsoft.com/office/drawing/2015/10/21/chartex" xmlns:cx3="http://schemas.microsoft.com/office/drawing/2016/5/9/chartex" xmlns:cx4="http://schemas.microsoft.com/office/drawing/2016/5/10/chartex" xmlns:cx5="http://schemas.microsoft.com/office/drawing/2016/5/11/chartex" xmlns:cx6="http://schemas.microsoft.com/office/drawing/2016/5/12/chartex" xmlns:cx7="http://schemas.microsoft.com/office/drawing/2016/5/13/chartex" xmlns:cx8="http://schemas.microsoft.com/office/drawing/2016/5/14/chartex" xmlns:mc="http://schemas.openxmlformats.org/markup-compatibility/2006" xmlns:aink="http://schemas.microsoft.com/office/drawing/2016/ink" xmlns:am3d="http://schemas.microsoft.com/office/drawing/2017/model3d" xmlns:o="urn:schemas-microsoft-com:office:office" xmlns:oel="http://schemas.microsoft.com/office/2019/extlst" xmlns:r="http://schemas.openxmlformats.org/officeDocument/2006/relationships" xmlns:m="http://schemas.openxmlformats.org/officeDocument/2006/math" xmlns:v="urn:schemas-microsoft-com:vml" xmlns:wp14="http://schemas.microsoft.com/office/word/2010/wordprocessingDrawing" xmlns:wp="http://schemas.openxmlformats.org/drawingml/2006/wordprocessingDrawing" xmlns:w10="urn:schemas-microsoft-com:office:word" xmlns:w="http://schemas.openxmlformats.org/wordprocessingml/2006/main" xmlns:w14="http://schemas.microsoft.com/office/word/2010/wordml" xmlns:w15="http://schemas.microsoft.com/office/word/2012/wordml" xmlns:w16cex="http://schemas.microsoft.com/office/word/2018/wordml/cex" xmlns:w16cid="http://schemas.microsoft.com/office/word/2016/wordml/cid" xmlns:w16="http://schemas.microsoft.com/office/word/2018/wordml" xmlns:w16du="http://schemas.microsoft.com/office/word/2023/wordml/word16du" xmlns:w16sdtdh="http://schemas.microsoft.com/office/word/2020/wordml/sdtdatahash" xmlns:w16sdtfl="http://schemas.microsoft.com/office/word/2024/wordml/sdtformatlock" xmlns:w16se="http://schemas.microsoft.com/office/word/2015/wordml/symex" xmlns:wpg="http://schemas.microsoft.com/office/word/2010/wordprocessingGroup" xmlns:wpi="http://schemas.microsoft.com/office/word/2010/wordprocessingInk" xmlns:wne="http://schemas.microsoft.com/office/word/2006/wordml" xmlns:wps="http://schemas.microsoft.com/office/word/2010/wordprocessingShape" mc:Ignorable="w14 w15 w16se w16cid w16 w16cex w16sdtdh w16sdtfl w16du wp14">
   <w:p>
     <w:pPr>
-      <w:pStyle w:val="Header"/>
+      <w:pStyle w:val="Cabealho"/>
     </w:pPr>
   </w:p>
 </w:hdr>
 </file>
 
 <file path=word/header2.xml><?xml version="1.0" encoding="utf-8"?>
-<w:hdr xmlns:wpc="http://schemas.microsoft.com/office/word/2010/wordprocessingCanvas" xmlns:cx="http://schemas.microsoft.com/office/drawing/2014/chartex" xmlns:cx1="http://schemas.microsoft.com/office/drawing/2015/9/8/chartex" xmlns:cx2="http://schemas.microsoft.com/office/drawing/2015/10/21/chartex" xmlns:cx3="http://schemas.microsoft.com/office/drawing/2016/5/9/chartex" xmlns:cx4="http://schemas.microsoft.com/office/drawing/2016/5/10/chartex" xmlns:cx5="http://schemas.microsoft.com/office/drawing/2016/5/11/chartex" xmlns:cx6="http://schemas.microsoft.com/office/drawing/2016/5/12/chartex" xmlns:cx7="http://schemas.microsoft.com/office/drawing/2016/5/13/chartex" xmlns:cx8="http://schemas.microsoft.com/office/drawing/2016/5/14/chartex" xmlns:mc="http://schemas.openxmlformats.org/markup-compatibility/2006" xmlns:aink="http://schemas.microsoft.com/office/drawing/2016/ink" xmlns:am3d="http://schemas.microsoft.com/office/drawing/2017/model3d" xmlns:o="urn:schemas-microsoft-com:office:office" xmlns:r="http://schemas.openxmlformats.org/officeDocument/2006/relationships" xmlns:m="http://schemas.openxmlformats.org/officeDocument/2006/math" xmlns:v="urn:schemas-microsoft-com:vml" xmlns:wp14="http://schemas.microsoft.com/office/word/2010/wordprocessingDrawing" xmlns:wp="http://schemas.openxmlformats.org/drawingml/2006/wordprocessingDrawing" xmlns:w10="urn:schemas-microsoft-com:office:word" xmlns:w="http://schemas.openxmlformats.org/wordprocessingml/2006/main" xmlns:w14="http://schemas.microsoft.com/office/word/2010/wordml" xmlns:w15="http://schemas.microsoft.com/office/word/2012/wordml" xmlns:w16cid="http://schemas.microsoft.com/office/word/2016/wordml/cid" xmlns:w16se="http://schemas.microsoft.com/office/word/2015/wordml/symex" xmlns:wpg="http://schemas.microsoft.com/office/word/2010/wordprocessingGroup" xmlns:wpi="http://schemas.microsoft.com/office/word/2010/wordprocessingInk" xmlns:wne="http://schemas.microsoft.com/office/word/2006/wordml" xmlns:wps="http://schemas.microsoft.com/office/word/2010/wordprocessingShape" mc:Ignorable="w14 w15 w16se w16cid wp14">
+<w:hdr xmlns:wpc="http://schemas.microsoft.com/office/word/2010/wordprocessingCanvas" xmlns:cx="http://schemas.microsoft.com/office/drawing/2014/chartex" xmlns:cx1="http://schemas.microsoft.com/office/drawing/2015/9/8/chartex" xmlns:cx2="http://schemas.microsoft.com/office/drawing/2015/10/21/chartex" xmlns:cx3="http://schemas.microsoft.com/office/drawing/2016/5/9/chartex" xmlns:cx4="http://schemas.microsoft.com/office/drawing/2016/5/10/chartex" xmlns:cx5="http://schemas.microsoft.com/office/drawing/2016/5/11/chartex" xmlns:cx6="http://schemas.microsoft.com/office/drawing/2016/5/12/chartex" xmlns:cx7="http://schemas.microsoft.com/office/drawing/2016/5/13/chartex" xmlns:cx8="http://schemas.microsoft.com/office/drawing/2016/5/14/chartex" xmlns:mc="http://schemas.openxmlformats.org/markup-compatibility/2006" xmlns:aink="http://schemas.microsoft.com/office/drawing/2016/ink" xmlns:am3d="http://schemas.microsoft.com/office/drawing/2017/model3d" xmlns:o="urn:schemas-microsoft-com:office:office" xmlns:oel="http://schemas.microsoft.com/office/2019/extlst" xmlns:r="http://schemas.openxmlformats.org/officeDocument/2006/relationships" xmlns:m="http://schemas.openxmlformats.org/officeDocument/2006/math" xmlns:v="urn:schemas-microsoft-com:vml" xmlns:wp14="http://schemas.microsoft.com/office/word/2010/wordprocessingDrawing" xmlns:wp="http://schemas.openxmlformats.org/drawingml/2006/wordprocessingDrawing" xmlns:w10="urn:schemas-microsoft-com:office:word" xmlns:w="http://schemas.openxmlformats.org/wordprocessingml/2006/main" xmlns:w14="http://schemas.microsoft.com/office/word/2010/wordml" xmlns:w15="http://schemas.microsoft.com/office/word/2012/wordml" xmlns:w16cex="http://schemas.microsoft.com/office/word/2018/wordml/cex" xmlns:w16cid="http://schemas.microsoft.com/office/word/2016/wordml/cid" xmlns:w16="http://schemas.microsoft.com/office/word/2018/wordml" xmlns:w16du="http://schemas.microsoft.com/office/word/2023/wordml/word16du" xmlns:w16sdtdh="http://schemas.microsoft.com/office/word/2020/wordml/sdtdatahash" xmlns:w16sdtfl="http://schemas.microsoft.com/office/word/2024/wordml/sdtformatlock" xmlns:w16se="http://schemas.microsoft.com/office/word/2015/wordml/symex" xmlns:wpg="http://schemas.microsoft.com/office/word/2010/wordprocessingGroup" xmlns:wpi="http://schemas.microsoft.com/office/word/2010/wordprocessingInk" xmlns:wne="http://schemas.microsoft.com/office/word/2006/wordml" xmlns:wps="http://schemas.microsoft.com/office/word/2010/wordprocessingShape" mc:Ignorable="w14 w15 w16se w16cid w16 w16cex w16sdtdh w16sdtfl w16du wp14">
   <w:p>
     <w:pPr>
       <w:widowControl w:val="0"/>
@@ -4206,9 +3904,9 @@
               <w:i/>
               <w:sz w:val="28"/>
               <w:szCs w:val="28"/>
+              <w:lang w:val="en-US"/>
             </w:rPr>
           </w:pPr>
-          <w:proofErr w:type="spellStart"/>
           <w:r>
             <w:rPr>
               <w:rFonts w:ascii="Garamond" w:eastAsia="Garamond" w:hAnsi="Garamond" w:cs="Garamond"/>
@@ -4216,107 +3914,9 @@
               <w:i/>
               <w:sz w:val="28"/>
               <w:szCs w:val="28"/>
+              <w:lang w:val="en-US"/>
             </w:rPr>
-            <w:t>Analysis</w:t>
-          </w:r>
-          <w:proofErr w:type="spellEnd"/>
-          <w:r>
-            <w:rPr>
-              <w:rFonts w:ascii="Garamond" w:eastAsia="Garamond" w:hAnsi="Garamond" w:cs="Garamond"/>
-              <w:b/>
-              <w:i/>
-              <w:sz w:val="28"/>
-              <w:szCs w:val="28"/>
-            </w:rPr>
-            <w:t xml:space="preserve"> </w:t>
-          </w:r>
-          <w:proofErr w:type="spellStart"/>
-          <w:r>
-            <w:rPr>
-              <w:rFonts w:ascii="Garamond" w:eastAsia="Garamond" w:hAnsi="Garamond" w:cs="Garamond"/>
-              <w:b/>
-              <w:i/>
-              <w:sz w:val="28"/>
-              <w:szCs w:val="28"/>
-            </w:rPr>
-            <w:t>and</w:t>
-          </w:r>
-          <w:proofErr w:type="spellEnd"/>
-          <w:r>
-            <w:rPr>
-              <w:rFonts w:ascii="Garamond" w:eastAsia="Garamond" w:hAnsi="Garamond" w:cs="Garamond"/>
-              <w:b/>
-              <w:i/>
-              <w:sz w:val="28"/>
-              <w:szCs w:val="28"/>
-            </w:rPr>
-            <w:t xml:space="preserve"> </w:t>
-          </w:r>
-          <w:proofErr w:type="spellStart"/>
-          <w:r>
-            <w:rPr>
-              <w:rFonts w:ascii="Garamond" w:eastAsia="Garamond" w:hAnsi="Garamond" w:cs="Garamond"/>
-              <w:b/>
-              <w:i/>
-              <w:sz w:val="28"/>
-              <w:szCs w:val="28"/>
-            </w:rPr>
-            <w:t>Synthesis</w:t>
-          </w:r>
-          <w:proofErr w:type="spellEnd"/>
-          <w:r>
-            <w:rPr>
-              <w:rFonts w:ascii="Garamond" w:eastAsia="Garamond" w:hAnsi="Garamond" w:cs="Garamond"/>
-              <w:b/>
-              <w:i/>
-              <w:sz w:val="28"/>
-              <w:szCs w:val="28"/>
-            </w:rPr>
-            <w:t xml:space="preserve"> </w:t>
-          </w:r>
-          <w:proofErr w:type="spellStart"/>
-          <w:r>
-            <w:rPr>
-              <w:rFonts w:ascii="Garamond" w:eastAsia="Garamond" w:hAnsi="Garamond" w:cs="Garamond"/>
-              <w:b/>
-              <w:i/>
-              <w:sz w:val="28"/>
-              <w:szCs w:val="28"/>
-            </w:rPr>
-            <w:t>of</w:t>
-          </w:r>
-          <w:proofErr w:type="spellEnd"/>
-          <w:r>
-            <w:rPr>
-              <w:rFonts w:ascii="Garamond" w:eastAsia="Garamond" w:hAnsi="Garamond" w:cs="Garamond"/>
-              <w:b/>
-              <w:i/>
-              <w:sz w:val="28"/>
-              <w:szCs w:val="28"/>
-            </w:rPr>
-            <w:t xml:space="preserve"> </w:t>
-          </w:r>
-          <w:proofErr w:type="spellStart"/>
-          <w:r>
-            <w:rPr>
-              <w:rFonts w:ascii="Garamond" w:eastAsia="Garamond" w:hAnsi="Garamond" w:cs="Garamond"/>
-              <w:b/>
-              <w:i/>
-              <w:sz w:val="28"/>
-              <w:szCs w:val="28"/>
-            </w:rPr>
-            <w:t>Algorithms</w:t>
-          </w:r>
-          <w:proofErr w:type="spellEnd"/>
-          <w:r>
-            <w:rPr>
-              <w:rFonts w:ascii="Garamond" w:eastAsia="Garamond" w:hAnsi="Garamond" w:cs="Garamond"/>
-              <w:b/>
-              <w:i/>
-              <w:sz w:val="28"/>
-              <w:szCs w:val="28"/>
-            </w:rPr>
-            <w:t xml:space="preserve"> </w:t>
+            <w:t xml:space="preserve">Analysis and Synthesis of Algorithms </w:t>
           </w:r>
         </w:p>
         <w:p>
@@ -4343,6 +3943,7 @@
               <w:b/>
               <w:sz w:val="28"/>
               <w:szCs w:val="28"/>
+              <w:lang w:val="en-US"/>
             </w:rPr>
           </w:pPr>
           <w:r>
@@ -4352,52 +3953,9 @@
               <w:i/>
               <w:sz w:val="28"/>
               <w:szCs w:val="28"/>
+              <w:lang w:val="en-US"/>
             </w:rPr>
-            <w:t xml:space="preserve">Design </w:t>
-          </w:r>
-          <w:proofErr w:type="spellStart"/>
-          <w:r>
-            <w:rPr>
-              <w:rFonts w:ascii="Garamond" w:eastAsia="Garamond" w:hAnsi="Garamond" w:cs="Garamond"/>
-              <w:b/>
-              <w:i/>
-              <w:sz w:val="28"/>
-              <w:szCs w:val="28"/>
-            </w:rPr>
-            <w:t>of</w:t>
-          </w:r>
-          <w:proofErr w:type="spellEnd"/>
-          <w:r>
-            <w:rPr>
-              <w:rFonts w:ascii="Garamond" w:eastAsia="Garamond" w:hAnsi="Garamond" w:cs="Garamond"/>
-              <w:b/>
-              <w:i/>
-              <w:sz w:val="28"/>
-              <w:szCs w:val="28"/>
-            </w:rPr>
-            <w:t xml:space="preserve"> </w:t>
-          </w:r>
-          <w:proofErr w:type="spellStart"/>
-          <w:r>
-            <w:rPr>
-              <w:rFonts w:ascii="Garamond" w:eastAsia="Garamond" w:hAnsi="Garamond" w:cs="Garamond"/>
-              <w:b/>
-              <w:i/>
-              <w:sz w:val="28"/>
-              <w:szCs w:val="28"/>
-            </w:rPr>
-            <w:t>Algorithms</w:t>
-          </w:r>
-          <w:proofErr w:type="spellEnd"/>
-          <w:r>
-            <w:rPr>
-              <w:rFonts w:ascii="Garamond" w:eastAsia="Garamond" w:hAnsi="Garamond" w:cs="Garamond"/>
-              <w:b/>
-              <w:i/>
-              <w:sz w:val="28"/>
-              <w:szCs w:val="28"/>
-            </w:rPr>
-            <w:t xml:space="preserve"> (DA)</w:t>
+            <w:t>Design of Algorithms (DA)</w:t>
           </w:r>
         </w:p>
       </w:tc>
@@ -4500,17 +4058,17 @@
 </file>
 
 <file path=word/header3.xml><?xml version="1.0" encoding="utf-8"?>
-<w:hdr xmlns:wpc="http://schemas.microsoft.com/office/word/2010/wordprocessingCanvas" xmlns:cx="http://schemas.microsoft.com/office/drawing/2014/chartex" xmlns:cx1="http://schemas.microsoft.com/office/drawing/2015/9/8/chartex" xmlns:cx2="http://schemas.microsoft.com/office/drawing/2015/10/21/chartex" xmlns:cx3="http://schemas.microsoft.com/office/drawing/2016/5/9/chartex" xmlns:cx4="http://schemas.microsoft.com/office/drawing/2016/5/10/chartex" xmlns:cx5="http://schemas.microsoft.com/office/drawing/2016/5/11/chartex" xmlns:cx6="http://schemas.microsoft.com/office/drawing/2016/5/12/chartex" xmlns:cx7="http://schemas.microsoft.com/office/drawing/2016/5/13/chartex" xmlns:cx8="http://schemas.microsoft.com/office/drawing/2016/5/14/chartex" xmlns:mc="http://schemas.openxmlformats.org/markup-compatibility/2006" xmlns:aink="http://schemas.microsoft.com/office/drawing/2016/ink" xmlns:am3d="http://schemas.microsoft.com/office/drawing/2017/model3d" xmlns:o="urn:schemas-microsoft-com:office:office" xmlns:r="http://schemas.openxmlformats.org/officeDocument/2006/relationships" xmlns:m="http://schemas.openxmlformats.org/officeDocument/2006/math" xmlns:v="urn:schemas-microsoft-com:vml" xmlns:wp14="http://schemas.microsoft.com/office/word/2010/wordprocessingDrawing" xmlns:wp="http://schemas.openxmlformats.org/drawingml/2006/wordprocessingDrawing" xmlns:w10="urn:schemas-microsoft-com:office:word" xmlns:w="http://schemas.openxmlformats.org/wordprocessingml/2006/main" xmlns:w14="http://schemas.microsoft.com/office/word/2010/wordml" xmlns:w15="http://schemas.microsoft.com/office/word/2012/wordml" xmlns:w16cid="http://schemas.microsoft.com/office/word/2016/wordml/cid" xmlns:w16se="http://schemas.microsoft.com/office/word/2015/wordml/symex" xmlns:wpg="http://schemas.microsoft.com/office/word/2010/wordprocessingGroup" xmlns:wpi="http://schemas.microsoft.com/office/word/2010/wordprocessingInk" xmlns:wne="http://schemas.microsoft.com/office/word/2006/wordml" xmlns:wps="http://schemas.microsoft.com/office/word/2010/wordprocessingShape" mc:Ignorable="w14 w15 w16se w16cid wp14">
+<w:hdr xmlns:wpc="http://schemas.microsoft.com/office/word/2010/wordprocessingCanvas" xmlns:cx="http://schemas.microsoft.com/office/drawing/2014/chartex" xmlns:cx1="http://schemas.microsoft.com/office/drawing/2015/9/8/chartex" xmlns:cx2="http://schemas.microsoft.com/office/drawing/2015/10/21/chartex" xmlns:cx3="http://schemas.microsoft.com/office/drawing/2016/5/9/chartex" xmlns:cx4="http://schemas.microsoft.com/office/drawing/2016/5/10/chartex" xmlns:cx5="http://schemas.microsoft.com/office/drawing/2016/5/11/chartex" xmlns:cx6="http://schemas.microsoft.com/office/drawing/2016/5/12/chartex" xmlns:cx7="http://schemas.microsoft.com/office/drawing/2016/5/13/chartex" xmlns:cx8="http://schemas.microsoft.com/office/drawing/2016/5/14/chartex" xmlns:mc="http://schemas.openxmlformats.org/markup-compatibility/2006" xmlns:aink="http://schemas.microsoft.com/office/drawing/2016/ink" xmlns:am3d="http://schemas.microsoft.com/office/drawing/2017/model3d" xmlns:o="urn:schemas-microsoft-com:office:office" xmlns:oel="http://schemas.microsoft.com/office/2019/extlst" xmlns:r="http://schemas.openxmlformats.org/officeDocument/2006/relationships" xmlns:m="http://schemas.openxmlformats.org/officeDocument/2006/math" xmlns:v="urn:schemas-microsoft-com:vml" xmlns:wp14="http://schemas.microsoft.com/office/word/2010/wordprocessingDrawing" xmlns:wp="http://schemas.openxmlformats.org/drawingml/2006/wordprocessingDrawing" xmlns:w10="urn:schemas-microsoft-com:office:word" xmlns:w="http://schemas.openxmlformats.org/wordprocessingml/2006/main" xmlns:w14="http://schemas.microsoft.com/office/word/2010/wordml" xmlns:w15="http://schemas.microsoft.com/office/word/2012/wordml" xmlns:w16cex="http://schemas.microsoft.com/office/word/2018/wordml/cex" xmlns:w16cid="http://schemas.microsoft.com/office/word/2016/wordml/cid" xmlns:w16="http://schemas.microsoft.com/office/word/2018/wordml" xmlns:w16du="http://schemas.microsoft.com/office/word/2023/wordml/word16du" xmlns:w16sdtdh="http://schemas.microsoft.com/office/word/2020/wordml/sdtdatahash" xmlns:w16sdtfl="http://schemas.microsoft.com/office/word/2024/wordml/sdtformatlock" xmlns:w16se="http://schemas.microsoft.com/office/word/2015/wordml/symex" xmlns:wpg="http://schemas.microsoft.com/office/word/2010/wordprocessingGroup" xmlns:wpi="http://schemas.microsoft.com/office/word/2010/wordprocessingInk" xmlns:wne="http://schemas.microsoft.com/office/word/2006/wordml" xmlns:wps="http://schemas.microsoft.com/office/word/2010/wordprocessingShape" mc:Ignorable="w14 w15 w16se w16cid w16 w16cex w16sdtdh w16sdtfl w16du wp14">
   <w:p>
     <w:pPr>
-      <w:pStyle w:val="Header"/>
+      <w:pStyle w:val="Cabealho"/>
     </w:pPr>
   </w:p>
 </w:hdr>
 </file>
 
 <file path=word/numbering.xml><?xml version="1.0" encoding="utf-8"?>
-<w:numbering xmlns:wpc="http://schemas.microsoft.com/office/word/2010/wordprocessingCanvas" xmlns:cx="http://schemas.microsoft.com/office/drawing/2014/chartex" xmlns:cx1="http://schemas.microsoft.com/office/drawing/2015/9/8/chartex" xmlns:cx2="http://schemas.microsoft.com/office/drawing/2015/10/21/chartex" xmlns:cx3="http://schemas.microsoft.com/office/drawing/2016/5/9/chartex" xmlns:cx4="http://schemas.microsoft.com/office/drawing/2016/5/10/chartex" xmlns:cx5="http://schemas.microsoft.com/office/drawing/2016/5/11/chartex" xmlns:cx6="http://schemas.microsoft.com/office/drawing/2016/5/12/chartex" xmlns:cx7="http://schemas.microsoft.com/office/drawing/2016/5/13/chartex" xmlns:cx8="http://schemas.microsoft.com/office/drawing/2016/5/14/chartex" xmlns:mc="http://schemas.openxmlformats.org/markup-compatibility/2006" xmlns:aink="http://schemas.microsoft.com/office/drawing/2016/ink" xmlns:am3d="http://schemas.microsoft.com/office/drawing/2017/model3d" xmlns:o="urn:schemas-microsoft-com:office:office" xmlns:r="http://schemas.openxmlformats.org/officeDocument/2006/relationships" xmlns:m="http://schemas.openxmlformats.org/officeDocument/2006/math" xmlns:v="urn:schemas-microsoft-com:vml" xmlns:wp14="http://schemas.microsoft.com/office/word/2010/wordprocessingDrawing" xmlns:wp="http://schemas.openxmlformats.org/drawingml/2006/wordprocessingDrawing" xmlns:w10="urn:schemas-microsoft-com:office:word" xmlns:w="http://schemas.openxmlformats.org/wordprocessingml/2006/main" xmlns:w14="http://schemas.microsoft.com/office/word/2010/wordml" xmlns:w15="http://schemas.microsoft.com/office/word/2012/wordml" xmlns:w16cid="http://schemas.microsoft.com/office/word/2016/wordml/cid" xmlns:w16se="http://schemas.microsoft.com/office/word/2015/wordml/symex" xmlns:wpg="http://schemas.microsoft.com/office/word/2010/wordprocessingGroup" xmlns:wpi="http://schemas.microsoft.com/office/word/2010/wordprocessingInk" xmlns:wne="http://schemas.microsoft.com/office/word/2006/wordml" xmlns:wps="http://schemas.microsoft.com/office/word/2010/wordprocessingShape" mc:Ignorable="w14 w15 w16se w16cid wp14">
+<w:numbering xmlns:wpc="http://schemas.microsoft.com/office/word/2010/wordprocessingCanvas" xmlns:cx="http://schemas.microsoft.com/office/drawing/2014/chartex" xmlns:cx1="http://schemas.microsoft.com/office/drawing/2015/9/8/chartex" xmlns:cx2="http://schemas.microsoft.com/office/drawing/2015/10/21/chartex" xmlns:cx3="http://schemas.microsoft.com/office/drawing/2016/5/9/chartex" xmlns:cx4="http://schemas.microsoft.com/office/drawing/2016/5/10/chartex" xmlns:cx5="http://schemas.microsoft.com/office/drawing/2016/5/11/chartex" xmlns:cx6="http://schemas.microsoft.com/office/drawing/2016/5/12/chartex" xmlns:cx7="http://schemas.microsoft.com/office/drawing/2016/5/13/chartex" xmlns:cx8="http://schemas.microsoft.com/office/drawing/2016/5/14/chartex" xmlns:mc="http://schemas.openxmlformats.org/markup-compatibility/2006" xmlns:aink="http://schemas.microsoft.com/office/drawing/2016/ink" xmlns:am3d="http://schemas.microsoft.com/office/drawing/2017/model3d" xmlns:o="urn:schemas-microsoft-com:office:office" xmlns:oel="http://schemas.microsoft.com/office/2019/extlst" xmlns:r="http://schemas.openxmlformats.org/officeDocument/2006/relationships" xmlns:m="http://schemas.openxmlformats.org/officeDocument/2006/math" xmlns:v="urn:schemas-microsoft-com:vml" xmlns:wp14="http://schemas.microsoft.com/office/word/2010/wordprocessingDrawing" xmlns:wp="http://schemas.openxmlformats.org/drawingml/2006/wordprocessingDrawing" xmlns:w10="urn:schemas-microsoft-com:office:word" xmlns:w="http://schemas.openxmlformats.org/wordprocessingml/2006/main" xmlns:w14="http://schemas.microsoft.com/office/word/2010/wordml" xmlns:w15="http://schemas.microsoft.com/office/word/2012/wordml" xmlns:w16cex="http://schemas.microsoft.com/office/word/2018/wordml/cex" xmlns:w16cid="http://schemas.microsoft.com/office/word/2016/wordml/cid" xmlns:w16="http://schemas.microsoft.com/office/word/2018/wordml" xmlns:w16du="http://schemas.microsoft.com/office/word/2023/wordml/word16du" xmlns:w16sdtdh="http://schemas.microsoft.com/office/word/2020/wordml/sdtdatahash" xmlns:w16sdtfl="http://schemas.microsoft.com/office/word/2024/wordml/sdtformatlock" xmlns:w16se="http://schemas.microsoft.com/office/word/2015/wordml/symex" xmlns:wpg="http://schemas.microsoft.com/office/word/2010/wordprocessingGroup" xmlns:wpi="http://schemas.microsoft.com/office/word/2010/wordprocessingInk" xmlns:wne="http://schemas.microsoft.com/office/word/2006/wordml" xmlns:wps="http://schemas.microsoft.com/office/word/2010/wordprocessingShape" mc:Ignorable="w14 w15 w16se w16cid w16 w16cex w16sdtdh w16sdtfl w16du wp14">
   <w:abstractNum w:abstractNumId="0" w15:restartNumberingAfterBreak="0">
     <w:nsid w:val="62F76CB3"/>
     <w:multiLevelType w:val="hybridMultilevel"/>
@@ -4600,14 +4158,14 @@
       </w:pPr>
     </w:lvl>
   </w:abstractNum>
-  <w:num w:numId="1">
+  <w:num w:numId="1" w16cid:durableId="190454333">
     <w:abstractNumId w:val="0"/>
   </w:num>
 </w:numbering>
 </file>
 
 <file path=word/styles.xml><?xml version="1.0" encoding="utf-8"?>
-<w:styles xmlns:mc="http://schemas.openxmlformats.org/markup-compatibility/2006" xmlns:r="http://schemas.openxmlformats.org/officeDocument/2006/relationships" xmlns:w="http://schemas.openxmlformats.org/wordprocessingml/2006/main" xmlns:w14="http://schemas.microsoft.com/office/word/2010/wordml" xmlns:w15="http://schemas.microsoft.com/office/word/2012/wordml" xmlns:w16cid="http://schemas.microsoft.com/office/word/2016/wordml/cid" xmlns:w16se="http://schemas.microsoft.com/office/word/2015/wordml/symex" mc:Ignorable="w14 w15 w16se w16cid">
+<w:styles xmlns:mc="http://schemas.openxmlformats.org/markup-compatibility/2006" xmlns:r="http://schemas.openxmlformats.org/officeDocument/2006/relationships" xmlns:w="http://schemas.openxmlformats.org/wordprocessingml/2006/main" xmlns:w14="http://schemas.microsoft.com/office/word/2010/wordml" xmlns:w15="http://schemas.microsoft.com/office/word/2012/wordml" xmlns:w16cex="http://schemas.microsoft.com/office/word/2018/wordml/cex" xmlns:w16cid="http://schemas.microsoft.com/office/word/2016/wordml/cid" xmlns:w16="http://schemas.microsoft.com/office/word/2018/wordml" xmlns:w16du="http://schemas.microsoft.com/office/word/2023/wordml/word16du" xmlns:w16sdtdh="http://schemas.microsoft.com/office/word/2020/wordml/sdtdatahash" xmlns:w16sdtfl="http://schemas.microsoft.com/office/word/2024/wordml/sdtformatlock" xmlns:w16se="http://schemas.microsoft.com/office/word/2015/wordml/symex" mc:Ignorable="w14 w15 w16se w16cid w16 w16cex w16sdtdh w16sdtfl w16du">
   <w:docDefaults>
     <w:rPrDefault>
       <w:rPr>
@@ -4623,7 +4181,7 @@
       </w:pPr>
     </w:pPrDefault>
   </w:docDefaults>
-  <w:latentStyles w:defLockedState="0" w:defUIPriority="99" w:defSemiHidden="0" w:defUnhideWhenUsed="0" w:defQFormat="0" w:count="375">
+  <w:latentStyles w:defLockedState="0" w:defUIPriority="99" w:defSemiHidden="0" w:defUnhideWhenUsed="0" w:defQFormat="0" w:count="376">
     <w:lsdException w:name="Normal" w:uiPriority="0" w:qFormat="1"/>
     <w:lsdException w:name="heading 1" w:uiPriority="9" w:qFormat="1"/>
     <w:lsdException w:name="heading 2" w:semiHidden="1" w:uiPriority="9" w:unhideWhenUsed="1" w:qFormat="1"/>
@@ -4999,12 +4557,13 @@
     <w:lsdException w:name="Smart Hyperlink" w:semiHidden="1" w:unhideWhenUsed="1"/>
     <w:lsdException w:name="Hashtag" w:semiHidden="1" w:unhideWhenUsed="1"/>
     <w:lsdException w:name="Unresolved Mention" w:semiHidden="1" w:unhideWhenUsed="1"/>
+    <w:lsdException w:name="Smart Link" w:semiHidden="1" w:unhideWhenUsed="1"/>
   </w:latentStyles>
   <w:style w:type="paragraph" w:default="1" w:styleId="Normal">
     <w:name w:val="Normal"/>
     <w:qFormat/>
   </w:style>
-  <w:style w:type="paragraph" w:styleId="Heading1">
+  <w:style w:type="paragraph" w:styleId="Ttulo1">
     <w:name w:val="heading 1"/>
     <w:basedOn w:val="Normal"/>
     <w:next w:val="Normal"/>
@@ -5021,7 +4580,7 @@
       <w:szCs w:val="40"/>
     </w:rPr>
   </w:style>
-  <w:style w:type="paragraph" w:styleId="Heading2">
+  <w:style w:type="paragraph" w:styleId="Ttulo2">
     <w:name w:val="heading 2"/>
     <w:basedOn w:val="Normal"/>
     <w:next w:val="Normal"/>
@@ -5039,7 +4598,7 @@
       <w:szCs w:val="32"/>
     </w:rPr>
   </w:style>
-  <w:style w:type="paragraph" w:styleId="Heading3">
+  <w:style w:type="paragraph" w:styleId="Ttulo3">
     <w:name w:val="heading 3"/>
     <w:basedOn w:val="Normal"/>
     <w:next w:val="Normal"/>
@@ -5059,7 +4618,7 @@
       <w:szCs w:val="28"/>
     </w:rPr>
   </w:style>
-  <w:style w:type="paragraph" w:styleId="Heading4">
+  <w:style w:type="paragraph" w:styleId="Ttulo4">
     <w:name w:val="heading 4"/>
     <w:basedOn w:val="Normal"/>
     <w:next w:val="Normal"/>
@@ -5079,7 +4638,7 @@
       <w:szCs w:val="24"/>
     </w:rPr>
   </w:style>
-  <w:style w:type="paragraph" w:styleId="Heading5">
+  <w:style w:type="paragraph" w:styleId="Ttulo5">
     <w:name w:val="heading 5"/>
     <w:basedOn w:val="Normal"/>
     <w:next w:val="Normal"/>
@@ -5097,7 +4656,7 @@
       <w:color w:val="666666"/>
     </w:rPr>
   </w:style>
-  <w:style w:type="paragraph" w:styleId="Heading6">
+  <w:style w:type="paragraph" w:styleId="Ttulo6">
     <w:name w:val="heading 6"/>
     <w:basedOn w:val="Normal"/>
     <w:next w:val="Normal"/>
@@ -5116,13 +4675,13 @@
       <w:color w:val="666666"/>
     </w:rPr>
   </w:style>
-  <w:style w:type="character" w:default="1" w:styleId="DefaultParagraphFont">
+  <w:style w:type="character" w:default="1" w:styleId="Tipodeletrapredefinidodopargrafo">
     <w:name w:val="Default Paragraph Font"/>
     <w:uiPriority w:val="1"/>
     <w:semiHidden/>
     <w:unhideWhenUsed/>
   </w:style>
-  <w:style w:type="table" w:default="1" w:styleId="TableNormal">
+  <w:style w:type="table" w:default="1" w:styleId="Tabelanormal">
     <w:name w:val="Normal Table"/>
     <w:uiPriority w:val="99"/>
     <w:semiHidden/>
@@ -5137,13 +4696,13 @@
       </w:tblCellMar>
     </w:tblPr>
   </w:style>
-  <w:style w:type="numbering" w:default="1" w:styleId="NoList">
+  <w:style w:type="numbering" w:default="1" w:styleId="Semlista">
     <w:name w:val="No List"/>
     <w:uiPriority w:val="99"/>
     <w:semiHidden/>
     <w:unhideWhenUsed/>
   </w:style>
-  <w:style w:type="paragraph" w:styleId="Title">
+  <w:style w:type="paragraph" w:styleId="Ttulo">
     <w:name w:val="Title"/>
     <w:basedOn w:val="Normal"/>
     <w:next w:val="Normal"/>
@@ -5159,7 +4718,7 @@
       <w:szCs w:val="52"/>
     </w:rPr>
   </w:style>
-  <w:style w:type="paragraph" w:styleId="Subtitle">
+  <w:style w:type="paragraph" w:styleId="Subttulo">
     <w:name w:val="Subtitle"/>
     <w:basedOn w:val="Normal"/>
     <w:next w:val="Normal"/>
@@ -5176,10 +4735,10 @@
       <w:szCs w:val="30"/>
     </w:rPr>
   </w:style>
-  <w:style w:type="paragraph" w:styleId="Header">
+  <w:style w:type="paragraph" w:styleId="Cabealho">
     <w:name w:val="header"/>
     <w:basedOn w:val="Normal"/>
-    <w:link w:val="HeaderChar"/>
+    <w:link w:val="CabealhoCarter"/>
     <w:uiPriority w:val="99"/>
     <w:unhideWhenUsed/>
     <w:rsid w:val="00547ED5"/>
@@ -5191,17 +4750,17 @@
       <w:spacing w:line="240" w:lineRule="auto"/>
     </w:pPr>
   </w:style>
-  <w:style w:type="character" w:customStyle="1" w:styleId="HeaderChar">
-    <w:name w:val="Header Char"/>
-    <w:basedOn w:val="DefaultParagraphFont"/>
-    <w:link w:val="Header"/>
+  <w:style w:type="character" w:customStyle="1" w:styleId="CabealhoCarter">
+    <w:name w:val="Cabeçalho Caráter"/>
+    <w:basedOn w:val="Tipodeletrapredefinidodopargrafo"/>
+    <w:link w:val="Cabealho"/>
     <w:uiPriority w:val="99"/>
     <w:rsid w:val="00547ED5"/>
   </w:style>
-  <w:style w:type="paragraph" w:styleId="Footer">
+  <w:style w:type="paragraph" w:styleId="Rodap">
     <w:name w:val="footer"/>
     <w:basedOn w:val="Normal"/>
-    <w:link w:val="FooterChar"/>
+    <w:link w:val="RodapCarter"/>
     <w:uiPriority w:val="99"/>
     <w:unhideWhenUsed/>
     <w:rsid w:val="00547ED5"/>
@@ -5213,14 +4772,14 @@
       <w:spacing w:line="240" w:lineRule="auto"/>
     </w:pPr>
   </w:style>
-  <w:style w:type="character" w:customStyle="1" w:styleId="FooterChar">
-    <w:name w:val="Footer Char"/>
-    <w:basedOn w:val="DefaultParagraphFont"/>
-    <w:link w:val="Footer"/>
+  <w:style w:type="character" w:customStyle="1" w:styleId="RodapCarter">
+    <w:name w:val="Rodapé Caráter"/>
+    <w:basedOn w:val="Tipodeletrapredefinidodopargrafo"/>
+    <w:link w:val="Rodap"/>
     <w:uiPriority w:val="99"/>
     <w:rsid w:val="00547ED5"/>
   </w:style>
-  <w:style w:type="paragraph" w:styleId="ListParagraph">
+  <w:style w:type="paragraph" w:styleId="PargrafodaLista">
     <w:name w:val="List Paragraph"/>
     <w:basedOn w:val="Normal"/>
     <w:uiPriority w:val="34"/>

</xml_diff>